<commit_message>
Drop the company-intro appendix line and the memo disclaimer.
Those two lines read like internal notes and should not go out with the investor pack.

Co-authored-by: Cursor <cursoragent@cursor.com>
</commit_message>
<xml_diff>
--- a/docs/seed-round-202609/灵祺种子轮-投资人备忘录.docx
+++ b/docs/seed-round-202609/灵祺种子轮-投资人备忘录.docx
@@ -7694,7 +7694,16 @@
         <w:rPr>
           <w:rFonts w:hint="eastAsia"/>
         </w:rPr>
-        <w:t xml:space="preserve">公司介绍（如需另附）</w:t>
+        <w:t xml:space="preserve">演示：商家</w:t>
+      </w:r>
+      <w:r>
+        <w:t xml:space="preserve"> ERP + </w:t>
+      </w:r>
+      <w:r>
+        <w:rPr>
+          <w:rFonts w:hint="eastAsia"/>
+        </w:rPr>
+        <w:t xml:space="preserve">星选（只读账号另附）</w:t>
       </w:r>
       <w:r>
         <w:br/>
@@ -7712,33 +7721,6 @@
         <w:rPr>
           <w:rFonts w:hint="eastAsia"/>
         </w:rPr>
-        <w:t xml:space="preserve">演示：商家</w:t>
-      </w:r>
-      <w:r>
-        <w:t xml:space="preserve"> ERP + </w:t>
-      </w:r>
-      <w:r>
-        <w:rPr>
-          <w:rFonts w:hint="eastAsia"/>
-        </w:rPr>
-        <w:t xml:space="preserve">星选（只读账号另附）</w:t>
-      </w:r>
-      <w:r>
-        <w:br/>
-      </w:r>
-    </w:p>
-    <w:p>
-      <w:pPr>
-        <w:pStyle w:val="Compact"/>
-        <w:numPr>
-          <w:ilvl w:val="0"/>
-          <w:numId w:val="1006"/>
-        </w:numPr>
-      </w:pPr>
-      <w:r>
-        <w:rPr>
-          <w:rFonts w:hint="eastAsia"/>
-        </w:rPr>
         <w:t xml:space="preserve">后续补充：3</w:t>
       </w:r>
       <w:r>
@@ -7749,26 +7731,6 @@
           <w:rFonts w:hint="eastAsia"/>
         </w:rPr>
         <w:t xml:space="preserve">家深度店案例包、股权结构、财务简表、软著扫描件</w:t>
-      </w:r>
-    </w:p>
-    <w:p>
-      <w:r>
-        <w:pict>
-          <v:rect style="width:0;height:1.5pt" o:hralign="center" o:hrstd="t" o:hr="t"/>
-        </w:pict>
-      </w:r>
-    </w:p>
-    <w:p>
-      <w:pPr>
-        <w:pStyle w:val="FirstParagraph"/>
-      </w:pPr>
-      <w:r>
-        <w:rPr>
-          <w:rFonts w:hint="eastAsia"/>
-          <w:i/>
-          <w:iCs/>
-        </w:rPr>
-        <w:t xml:space="preserve">数字均可在生产系统当面复核。融资条款以正式投资协议为准。市场公开数据为转述，投前请律师与财务顾问复核。</w:t>
       </w:r>
     </w:p>
     <w:bookmarkEnd w:id="34"/>

</xml_diff>